<commit_message>
Schedule: hacking Sat 15:00 to Sun 15:00, awards 18:20, so SAT takers can come
</commit_message>
<xml_diff>
--- a/Sponsorship Proposal.docx
+++ b/Sponsorship Proposal.docx
@@ -113,7 +113,7 @@
         <w:rPr>
           <w:rtl w:val="0"/>
         </w:rPr>
-        <w:t xml:space="preserve"> A 24-hour hackathon where 220+ youths in about 55 teams build working prototypes for real problems. Five tracks on the model of Stanford's TreeHacks: Healthcare, Sustainability, Education, Humanity and AI. Software only. The event runs in English. Teams start Saturday 13:00 and submit Sunday 13:00; professional judges score every team; the best in each track presents on stage.</w:t>
+        <w:t xml:space="preserve"> A 24-hour hackathon where 220+ youths in about 55 teams build working prototypes for real problems. Five tracks on the model of Stanford's TreeHacks: Healthcare, Sustainability, Education, Humanity and AI. Software only. The event runs in English. Teams start Saturday 15:00 and submit Sunday 15:00; professional judges score every team; the best in each track presents on stage.</w:t>
       </w:r>
     </w:p>
     <w:p>
@@ -157,7 +157,7 @@
         <w:rPr>
           <w:rtl w:val="0"/>
         </w:rPr>
-        <w:t xml:space="preserve"> Saturday November 7 to Sunday November 8, 2026, in Ulaanbaatar; the venue is confirmed by October 14. Doors 11:00 Saturday, awards 16:20 Sunday.</w:t>
+        <w:t xml:space="preserve"> Saturday November 7 to Sunday November 8, 2026, in Ulaanbaatar; the venue is confirmed by October 14. Doors 13:00 Saturday, awards 18:20 Sunday.</w:t>
       </w:r>
     </w:p>
     <w:p>

</xml_diff>

<commit_message>
Event moved to Nov 28-29, 13:00 to 13:00; deadlines three weeks later
</commit_message>
<xml_diff>
--- a/Sponsorship Proposal.docx
+++ b/Sponsorship Proposal.docx
@@ -37,7 +37,7 @@
           <w:szCs w:val="28"/>
           <w:rtl w:val="0"/>
         </w:rPr>
-        <w:t xml:space="preserve">A 24-hour youth hackathon · Healthcare · Sustainability · Education · Humanity · AI · Mongolia · November 7–8, 2026</w:t>
+        <w:t xml:space="preserve">A 24-hour youth hackathon · Healthcare · Sustainability · Education · Humanity · AI · Mongolia · November 28–29, 2026</w:t>
       </w:r>
     </w:p>
     <w:p>
@@ -113,7 +113,7 @@
         <w:rPr>
           <w:rtl w:val="0"/>
         </w:rPr>
-        <w:t xml:space="preserve"> A 24-hour hackathon where 220+ youths in about 55 teams build working prototypes for real problems. Five tracks on the model of Stanford's TreeHacks: Healthcare, Sustainability, Education, Humanity and AI. Software only. The event runs in English. Teams start Saturday 15:00 and submit Sunday 15:00; professional judges score every team; the best in each track presents on stage.</w:t>
+        <w:t xml:space="preserve"> A 24-hour hackathon where 220+ youths in about 55 teams build working prototypes for real problems. Five tracks on the model of Stanford's TreeHacks: Healthcare, Sustainability, Education, Humanity and AI. Software only. The event runs in English. Teams start Saturday 13:00 and submit Sunday 13:00; professional judges score every team; the best in each track presents on stage.</w:t>
       </w:r>
     </w:p>
     <w:p>
@@ -157,7 +157,7 @@
         <w:rPr>
           <w:rtl w:val="0"/>
         </w:rPr>
-        <w:t xml:space="preserve"> Saturday November 7 to Sunday November 8, 2026, in Ulaanbaatar; the venue is confirmed by October 14. Doors 13:00 Saturday, awards 18:20 Sunday.</w:t>
+        <w:t xml:space="preserve"> Saturday November 28 to Sunday November 29, 2026, in Ulaanbaatar; the venue is confirmed by November 4. Doors 11:00 Saturday, awards 16:20 Sunday.</w:t>
       </w:r>
     </w:p>
     <w:p>
@@ -393,7 +393,7 @@
           <w:bCs w:val="1"/>
           <w:rtl w:val="0"/>
         </w:rPr>
-        <w:t xml:space="preserve">Commitments close October 25, 2026.</w:t>
+        <w:t xml:space="preserve">Commitments close November 15, 2026.</w:t>
       </w:r>
       <w:r>
         <w:rPr>
@@ -1814,7 +1814,7 @@
           <w:bCs w:val="1"/>
           <w:rtl w:val="0"/>
         </w:rPr>
-        <w:t xml:space="preserve">October 25, 2026</w:t>
+        <w:t xml:space="preserve">November 15, 2026</w:t>
       </w:r>
       <w:r>
         <w:rPr>
@@ -1850,7 +1850,7 @@
         <w:rPr>
           <w:rtl w:val="0"/>
         </w:rPr>
-        <w:t xml:space="preserve">Send your logo and a 40-word description. Name your judge, and for track sponsors your workshop speaker, by October 30.</w:t>
+        <w:t xml:space="preserve">Send your logo and a 40-word description. Name your judge, and for track sponsors your workshop speaker, by November 20.</w:t>
       </w:r>
     </w:p>
     <w:p>

</xml_diff>